<commit_message>
Update Updating Enno initial Newsvendor app.docx
</commit_message>
<xml_diff>
--- a/Updating Enno initial Newsvendor app.docx
+++ b/Updating Enno initial Newsvendor app.docx
@@ -89,15 +89,7 @@
         <w:t>none</w:t>
       </w:r>
       <w:r>
-        <w:t xml:space="preserve"> </w:t>
-      </w:r>
-      <w:proofErr w:type="gramStart"/>
-      <w:r>
-        <w:t>pass</w:t>
-      </w:r>
-      <w:proofErr w:type="gramEnd"/>
-      <w:r>
-        <w:t xml:space="preserve">, it returns </w:t>
+        <w:t xml:space="preserve"> pass, it returns </w:t>
       </w:r>
       <w:r>
         <w:rPr>
@@ -133,15 +125,7 @@
       </w:r>
       <w:r>
         <w:lastRenderedPageBreak/>
-        <w:t xml:space="preserve">attempts and returns that one. </w:t>
-      </w:r>
-      <w:proofErr w:type="gramStart"/>
-      <w:r>
-        <w:t>So</w:t>
-      </w:r>
-      <w:proofErr w:type="gramEnd"/>
-      <w:r>
-        <w:t xml:space="preserve"> you always get a valid dataset — it just might not be statistically perfect, which is fine for gameplay.</w:t>
+        <w:t>attempts and returns that one. So you always get a valid dataset — it just might not be statistically perfect, which is fine for gameplay.</w:t>
       </w:r>
     </w:p>
     <w:p>
@@ -157,17 +141,8 @@
         </w:rPr>
       </w:pPr>
       <w:r>
-        <w:t>functions\</w:t>
-      </w:r>
-      <w:proofErr w:type="spellStart"/>
-      <w:r>
-        <w:t>src</w:t>
-      </w:r>
-      <w:proofErr w:type="spellEnd"/>
-      <w:r>
-        <w:t>\</w:t>
-      </w:r>
-      <w:proofErr w:type="spellStart"/>
+        <w:t>functions\src\</w:t>
+      </w:r>
       <w:r>
         <w:rPr>
           <w:b/>
@@ -175,7 +150,6 @@
         </w:rPr>
         <w:t>demand.ts</w:t>
       </w:r>
-      <w:proofErr w:type="spellEnd"/>
     </w:p>
     <w:p>
       <w:r>
@@ -183,38 +157,14 @@
       </w:r>
     </w:p>
     <w:p>
-      <w:proofErr w:type="spellStart"/>
-      <w:r>
-        <w:t>npm</w:t>
-      </w:r>
-      <w:proofErr w:type="spellEnd"/>
-      <w:r>
-        <w:t xml:space="preserve"> run </w:t>
-      </w:r>
-      <w:proofErr w:type="spellStart"/>
-      <w:proofErr w:type="gramStart"/>
-      <w:r>
-        <w:t>build:functions</w:t>
-      </w:r>
-      <w:proofErr w:type="spellEnd"/>
-      <w:proofErr w:type="gramEnd"/>
-    </w:p>
-    <w:p>
-      <w:proofErr w:type="spellStart"/>
-      <w:r>
-        <w:t>npm</w:t>
-      </w:r>
-      <w:proofErr w:type="spellEnd"/>
-      <w:r>
-        <w:t xml:space="preserve"> run </w:t>
-      </w:r>
-      <w:proofErr w:type="spellStart"/>
-      <w:proofErr w:type="gramStart"/>
-      <w:r>
-        <w:t>deploy:functions</w:t>
-      </w:r>
-      <w:proofErr w:type="spellEnd"/>
-      <w:proofErr w:type="gramEnd"/>
+      <w:r>
+        <w:t>npm run build:functions</w:t>
+      </w:r>
+    </w:p>
+    <w:p>
+      <w:r>
+        <w:t>npm run deploy:functions</w:t>
+      </w:r>
     </w:p>
     <w:p>
       <w:r>
@@ -280,23 +230,7 @@
         <w:t>Top plot — Histogram:</w:t>
       </w:r>
       <w:r>
-        <w:t xml:space="preserve"> Shows the frequency distribution of all demand observations so far (n=55, which is the 50 training samples + 5 revealed days from Week 1). The x-axis is </w:t>
-      </w:r>
-      <w:proofErr w:type="gramStart"/>
-      <w:r>
-        <w:t>demand</w:t>
-      </w:r>
-      <w:proofErr w:type="gramEnd"/>
-      <w:r>
-        <w:t xml:space="preserve"> ranges (bins), the y-axis is how many days </w:t>
-      </w:r>
-      <w:proofErr w:type="gramStart"/>
-      <w:r>
-        <w:t>fell</w:t>
-      </w:r>
-      <w:proofErr w:type="gramEnd"/>
-      <w:r>
-        <w:t xml:space="preserve"> in each range. The orange curve is the fitted normal distribution. You can see demand is roughly bell-shaped, centered around 42–59, with occasional very low or high days.</w:t>
+        <w:t xml:space="preserve"> Shows the frequency distribution of all demand observations so far (n=55, which is the 50 training samples + 5 revealed days from Week 1). The x-axis is demand ranges (bins), the y-axis is how many days fell in each range. The orange curve is the fitted normal distribution. You can see demand is roughly bell-shaped, centered around 42–59, with occasional very low or high days.</w:t>
       </w:r>
     </w:p>
     <w:p>
@@ -308,28 +242,12 @@
         <w:t>Bottom plot — Time series:</w:t>
       </w:r>
       <w:r>
-        <w:t xml:space="preserve"> Shows demand day-by-day in chronological order. The x-axis is the day number (1 through 65), the y-axis is the actual demand that day. The first 50 points are the training data given to you at the start. The last 5 (after the gap/dot) are the revealed demand from Week 1 — the actual days you just played. This helps you see the volatility and whether there are any trends (there shouldn't </w:t>
-      </w:r>
-      <w:proofErr w:type="gramStart"/>
-      <w:r>
-        <w:t>be —</w:t>
-      </w:r>
-      <w:proofErr w:type="gramEnd"/>
-      <w:r>
-        <w:t xml:space="preserve"> it's random draws from a fixed distribution).</w:t>
-      </w:r>
-    </w:p>
-    <w:p>
-      <w:r>
-        <w:t xml:space="preserve">Together they help the player understand: the demand is noisy but stable around the mean, and the smart move is to keep ordering near the critical </w:t>
-      </w:r>
-      <w:proofErr w:type="spellStart"/>
-      <w:r>
-        <w:t>fractile</w:t>
-      </w:r>
-      <w:proofErr w:type="spellEnd"/>
-      <w:r>
-        <w:t xml:space="preserve"> (~67) rather than reacting to individual good or bad days.</w:t>
+        <w:t xml:space="preserve"> Shows demand day-by-day in chronological order. The x-axis is the day number (1 through 65), the y-axis is the actual demand that day. The first 50 points are the training data given to you at the start. The last 5 (after the gap/dot) are the revealed demand from Week 1 — the actual days you just played. This helps you see the volatility and whether there are any trends (there shouldn't be — it's random draws from a fixed distribution).</w:t>
+      </w:r>
+    </w:p>
+    <w:p>
+      <w:r>
+        <w:t>Together they help the player understand: the demand is noisy but stable around the mean, and the smart move is to keep ordering near the critical fractile (~67) rather than reacting to individual good or bad days.</w:t>
       </w:r>
     </w:p>
     <w:p/>
@@ -342,23 +260,7 @@
         <w:t>FIX</w:t>
       </w:r>
       <w:r>
-        <w:t xml:space="preserve">: Add description on x and y axis. </w:t>
-      </w:r>
-      <w:proofErr w:type="gramStart"/>
-      <w:r>
-        <w:t>Also</w:t>
-      </w:r>
-      <w:proofErr w:type="gramEnd"/>
-      <w:r>
-        <w:t xml:space="preserve"> past data at the bottom should be shown e.g. in green and all new data should be with that yellow color. Also, show on the x-axis text for each phase, e.g. “past data”, “week 1”, then “week 2” </w:t>
-      </w:r>
-      <w:proofErr w:type="spellStart"/>
-      <w:r>
-        <w:t>etc</w:t>
-      </w:r>
-      <w:proofErr w:type="spellEnd"/>
-      <w:r>
-        <w:t xml:space="preserve"> (corresponding on the associated days).</w:t>
+        <w:t>: Add description on x and y axis. Also past data at the bottom should be shown e.g. in green and all new data should be with that yellow color. Also, show on the x-axis text for each phase, e.g. “past data”, “week 1”, then “week 2” etc (corresponding on the associated days).</w:t>
       </w:r>
     </w:p>
     <w:p/>
@@ -368,50 +270,19 @@
       </w:r>
     </w:p>
     <w:p>
-      <w:proofErr w:type="spellStart"/>
-      <w:r>
-        <w:t>src</w:t>
-      </w:r>
-      <w:proofErr w:type="spellEnd"/>
-      <w:r>
-        <w:t>\components\</w:t>
-      </w:r>
-      <w:proofErr w:type="spellStart"/>
-      <w:r>
-        <w:t>TrainingChart.tsx</w:t>
-      </w:r>
-      <w:proofErr w:type="spellEnd"/>
-      <w:r>
-        <w:t xml:space="preserve"> </w:t>
-      </w:r>
-    </w:p>
-    <w:p>
-      <w:proofErr w:type="spellStart"/>
-      <w:r>
-        <w:t>src</w:t>
-      </w:r>
-      <w:proofErr w:type="spellEnd"/>
-      <w:r>
-        <w:t>\pages\</w:t>
-      </w:r>
-      <w:proofErr w:type="spellStart"/>
-      <w:r>
-        <w:t>PlayerGame.tsx</w:t>
-      </w:r>
-      <w:proofErr w:type="spellEnd"/>
+      <w:r>
+        <w:t xml:space="preserve">src\components\TrainingChart.tsx </w:t>
+      </w:r>
+    </w:p>
+    <w:p>
+      <w:r>
+        <w:t>src\pages\PlayerGame.tsx</w:t>
+      </w:r>
     </w:p>
     <w:p/>
     <w:p>
       <w:r>
-        <w:t xml:space="preserve">Then test with </w:t>
-      </w:r>
-      <w:proofErr w:type="spellStart"/>
-      <w:r>
-        <w:t>npm</w:t>
-      </w:r>
-      <w:proofErr w:type="spellEnd"/>
-      <w:r>
-        <w:t xml:space="preserve"> run dev and check localhost:5173. You should see:</w:t>
+        <w:t>Then test with npm run dev and check localhost:5173. You should see:</w:t>
       </w:r>
     </w:p>
     <w:p>
@@ -517,25 +388,7 @@
     </w:p>
     <w:p>
       <w:r>
-        <w:t xml:space="preserve">When happy, deploy with </w:t>
-      </w:r>
-      <w:proofErr w:type="spellStart"/>
-      <w:r>
-        <w:t>npm</w:t>
-      </w:r>
-      <w:proofErr w:type="spellEnd"/>
-      <w:r>
-        <w:t xml:space="preserve"> run </w:t>
-      </w:r>
-      <w:proofErr w:type="spellStart"/>
-      <w:proofErr w:type="gramStart"/>
-      <w:r>
-        <w:t>deploy:hosting</w:t>
-      </w:r>
-      <w:proofErr w:type="spellEnd"/>
-      <w:proofErr w:type="gramEnd"/>
-      <w:r>
-        <w:t>.</w:t>
+        <w:t>When happy, deploy with npm run deploy:hosting.</w:t>
       </w:r>
     </w:p>
     <w:p/>
@@ -680,15 +533,7 @@
         <w:t>FIX on instructor dashboard</w:t>
       </w:r>
       <w:r>
-        <w:t xml:space="preserve"> “3 weeks x 5 days = 15 decisions”. Our decided quantity stays fixed for the entire week, so that should be </w:t>
-      </w:r>
-      <w:proofErr w:type="gramStart"/>
-      <w:r>
-        <w:t>actually only</w:t>
-      </w:r>
-      <w:proofErr w:type="gramEnd"/>
-      <w:r>
-        <w:t xml:space="preserve"> 3 decisions</w:t>
+        <w:t xml:space="preserve"> “3 weeks x 5 days = 15 decisions”. Our decided quantity stays fixed for the entire week, so that should be actually only 3 decisions</w:t>
       </w:r>
       <w:r>
         <w:t>:</w:t>
@@ -754,7 +599,6 @@
       </w:r>
     </w:p>
     <w:p>
-      <w:proofErr w:type="spellStart"/>
       <w:r>
         <w:rPr>
           <w:b/>
@@ -762,25 +606,8 @@
         </w:rPr>
         <w:t>Host.tsx</w:t>
       </w:r>
-      <w:proofErr w:type="spellEnd"/>
-      <w:r>
-        <w:t xml:space="preserve"> → </w:t>
-      </w:r>
-      <w:proofErr w:type="spellStart"/>
-      <w:r>
-        <w:t>src</w:t>
-      </w:r>
-      <w:proofErr w:type="spellEnd"/>
-      <w:r>
-        <w:t>\pages\</w:t>
-      </w:r>
-      <w:proofErr w:type="spellStart"/>
-      <w:r>
-        <w:t>Host.tsx</w:t>
-      </w:r>
-      <w:proofErr w:type="spellEnd"/>
-      <w:r>
-        <w:t xml:space="preserve"> (frontend):</w:t>
+      <w:r>
+        <w:t xml:space="preserve"> → src\pages\Host.tsx (frontend):</w:t>
       </w:r>
     </w:p>
     <w:p>
@@ -831,7 +658,6 @@
       </w:r>
     </w:p>
     <w:p>
-      <w:proofErr w:type="spellStart"/>
       <w:r>
         <w:rPr>
           <w:b/>
@@ -840,25 +666,8 @@
         <w:lastRenderedPageBreak/>
         <w:t>index.ts</w:t>
       </w:r>
-      <w:proofErr w:type="spellEnd"/>
-      <w:r>
-        <w:t xml:space="preserve"> → functions\</w:t>
-      </w:r>
-      <w:proofErr w:type="spellStart"/>
-      <w:r>
-        <w:t>src</w:t>
-      </w:r>
-      <w:proofErr w:type="spellEnd"/>
-      <w:r>
-        <w:t>\</w:t>
-      </w:r>
-      <w:proofErr w:type="spellStart"/>
-      <w:r>
-        <w:t>index.ts</w:t>
-      </w:r>
-      <w:proofErr w:type="spellEnd"/>
-      <w:r>
-        <w:t xml:space="preserve"> (backend):</w:t>
+      <w:r>
+        <w:t xml:space="preserve"> → functions\src\index.ts (backend):</w:t>
       </w:r>
     </w:p>
     <w:p>
@@ -893,13 +702,8 @@
       </w:r>
     </w:p>
     <w:p>
-      <w:proofErr w:type="spellStart"/>
-      <w:r>
-        <w:t>npm</w:t>
-      </w:r>
-      <w:proofErr w:type="spellEnd"/>
-      <w:r>
-        <w:t xml:space="preserve"> run deploy</w:t>
+      <w:r>
+        <w:t>npm run deploy</w:t>
       </w:r>
     </w:p>
     <w:p>
@@ -914,15 +718,7 @@
         <w:t xml:space="preserve">ISSUE: </w:t>
       </w:r>
       <w:r>
-        <w:t xml:space="preserve">I </w:t>
-      </w:r>
-      <w:proofErr w:type="gramStart"/>
-      <w:r>
-        <w:t>am not able to</w:t>
-      </w:r>
-      <w:proofErr w:type="gramEnd"/>
-      <w:r>
-        <w:t xml:space="preserve"> delete several test sessions:</w:t>
+        <w:t>I am not able to delete several test sessions:</w:t>
       </w:r>
     </w:p>
     <w:p>
@@ -1028,15 +824,7 @@
     <w:p/>
     <w:p>
       <w:r>
-        <w:t xml:space="preserve">Once instructor creates a session, the session should automatically start. Why </w:t>
-      </w:r>
-      <w:proofErr w:type="gramStart"/>
-      <w:r>
-        <w:t>waiting</w:t>
-      </w:r>
-      <w:proofErr w:type="gramEnd"/>
-      <w:r>
-        <w:t xml:space="preserve"> to see how many students will sign up?</w:t>
+        <w:t>Once instructor creates a session, the session should automatically start. Why waiting to see how many students will sign up?</w:t>
       </w:r>
     </w:p>
     <w:p/>
@@ -1091,15 +879,7 @@
     </w:p>
     <w:p>
       <w:r>
-        <w:t xml:space="preserve">Once player Alex submits their Q*, the game only proceeds once all players have also chosen their Q*. This is bad and </w:t>
-      </w:r>
-      <w:proofErr w:type="gramStart"/>
-      <w:r>
-        <w:t>has to</w:t>
-      </w:r>
-      <w:proofErr w:type="gramEnd"/>
-      <w:r>
-        <w:t xml:space="preserve"> be fixed asap.</w:t>
+        <w:t>Once player Alex submits their Q*, the game only proceeds once all players have also chosen their Q*. This is bad and has to be fixed asap.</w:t>
       </w:r>
     </w:p>
     <w:p>
@@ -1155,15 +935,7 @@
     <w:p/>
     <w:p>
       <w:r>
-        <w:t xml:space="preserve">This message at the bottom is easy to miss, center it </w:t>
-      </w:r>
-      <w:proofErr w:type="gramStart"/>
-      <w:r>
-        <w:t>at</w:t>
-      </w:r>
-      <w:proofErr w:type="gramEnd"/>
-      <w:r>
-        <w:t xml:space="preserve"> the main page, and should last more seconds so that people do read it!</w:t>
+        <w:t>This message at the bottom is easy to miss, center it at the main page, and should last more seconds so that people do read it!</w:t>
       </w:r>
     </w:p>
     <w:p/>
@@ -1178,7 +950,6 @@
       </w:r>
     </w:p>
     <w:p>
-      <w:proofErr w:type="spellStart"/>
       <w:r>
         <w:rPr>
           <w:b/>
@@ -1186,25 +957,8 @@
         </w:rPr>
         <w:t>Host.tsx</w:t>
       </w:r>
-      <w:proofErr w:type="spellEnd"/>
-      <w:r>
-        <w:t xml:space="preserve"> → </w:t>
-      </w:r>
-      <w:proofErr w:type="spellStart"/>
-      <w:r>
-        <w:t>src</w:t>
-      </w:r>
-      <w:proofErr w:type="spellEnd"/>
-      <w:r>
-        <w:t>\pages\</w:t>
-      </w:r>
-      <w:proofErr w:type="spellStart"/>
-      <w:r>
-        <w:t>Host.tsx</w:t>
-      </w:r>
-      <w:proofErr w:type="spellEnd"/>
-      <w:r>
-        <w:t>:</w:t>
+      <w:r>
+        <w:t xml:space="preserve"> → src\pages\Host.tsx:</w:t>
       </w:r>
     </w:p>
     <w:p>
@@ -1225,15 +979,7 @@
         <w:t>centered modal</w:t>
       </w:r>
       <w:r>
-        <w:t xml:space="preserve"> instead of the ugly browser </w:t>
-      </w:r>
-      <w:proofErr w:type="gramStart"/>
-      <w:r>
-        <w:t>confirm(</w:t>
-      </w:r>
-      <w:proofErr w:type="gramEnd"/>
-      <w:r>
-        <w:t>) dialog</w:t>
+        <w:t xml:space="preserve"> instead of the ugly browser confirm() dialog</w:t>
       </w:r>
     </w:p>
     <w:p>
@@ -1248,7 +994,6 @@
       </w:r>
     </w:p>
     <w:p>
-      <w:proofErr w:type="spellStart"/>
       <w:r>
         <w:rPr>
           <w:b/>
@@ -1256,25 +1001,8 @@
         </w:rPr>
         <w:t>PlayerGame.tsx</w:t>
       </w:r>
-      <w:proofErr w:type="spellEnd"/>
-      <w:r>
-        <w:t xml:space="preserve"> → </w:t>
-      </w:r>
-      <w:proofErr w:type="spellStart"/>
-      <w:r>
-        <w:t>src</w:t>
-      </w:r>
-      <w:proofErr w:type="spellEnd"/>
-      <w:r>
-        <w:t>\pages\</w:t>
-      </w:r>
-      <w:proofErr w:type="spellStart"/>
-      <w:r>
-        <w:t>PlayerGame.tsx</w:t>
-      </w:r>
-      <w:proofErr w:type="spellEnd"/>
-      <w:r>
-        <w:t>:</w:t>
+      <w:r>
+        <w:t xml:space="preserve"> → src\pages\PlayerGame.tsx:</w:t>
       </w:r>
     </w:p>
     <w:p>
@@ -1288,21 +1016,12 @@
         <w:lastRenderedPageBreak/>
         <w:t xml:space="preserve">"Bake plan submitted" is now a </w:t>
       </w:r>
-      <w:proofErr w:type="gramStart"/>
       <w:r>
         <w:rPr>
           <w:b/>
           <w:bCs/>
         </w:rPr>
-        <w:t>large centered</w:t>
-      </w:r>
-      <w:proofErr w:type="gramEnd"/>
-      <w:r>
-        <w:rPr>
-          <w:b/>
-          <w:bCs/>
-        </w:rPr>
-        <w:t xml:space="preserve"> overlay</w:t>
+        <w:t>large centered overlay</w:t>
       </w:r>
       <w:r>
         <w:t xml:space="preserve"> with a </w:t>
@@ -1357,43 +1076,7 @@
     </w:p>
     <w:p>
       <w:r>
-        <w:t xml:space="preserve">Test with </w:t>
-      </w:r>
-      <w:proofErr w:type="spellStart"/>
-      <w:r>
-        <w:t>npm</w:t>
-      </w:r>
-      <w:proofErr w:type="spellEnd"/>
-      <w:r>
-        <w:t xml:space="preserve"> run dev, then deploy with </w:t>
-      </w:r>
-      <w:proofErr w:type="spellStart"/>
-      <w:r>
-        <w:t>npm</w:t>
-      </w:r>
-      <w:proofErr w:type="spellEnd"/>
-      <w:r>
-        <w:t xml:space="preserve"> run </w:t>
-      </w:r>
-      <w:proofErr w:type="spellStart"/>
-      <w:proofErr w:type="gramStart"/>
-      <w:r>
-        <w:t>deploy:hosting</w:t>
-      </w:r>
-      <w:proofErr w:type="spellEnd"/>
-      <w:proofErr w:type="gramEnd"/>
-      <w:r>
-        <w:t xml:space="preserve"> (and </w:t>
-      </w:r>
-      <w:proofErr w:type="spellStart"/>
-      <w:proofErr w:type="gramStart"/>
-      <w:r>
-        <w:t>deploy:functions</w:t>
-      </w:r>
-      <w:proofErr w:type="spellEnd"/>
-      <w:proofErr w:type="gramEnd"/>
-      <w:r>
-        <w:t xml:space="preserve"> too since you still need the delete fix from earlier).</w:t>
+        <w:t>Test with npm run dev, then deploy with npm run deploy:hosting (and deploy:functions too since you still need the delete fix from earlier).</w:t>
       </w:r>
     </w:p>
     <w:p/>
@@ -1443,15 +1126,7 @@
     <w:p/>
     <w:p>
       <w:r>
-        <w:t xml:space="preserve">Leaderboard rank should </w:t>
-      </w:r>
-      <w:proofErr w:type="gramStart"/>
-      <w:r>
-        <w:t>say</w:t>
-      </w:r>
-      <w:proofErr w:type="gramEnd"/>
-      <w:r>
-        <w:t xml:space="preserve"> more information on their per period decisions, demand and profit. Then also say 1</w:t>
+        <w:t>Leaderboard rank should say more information on their per period decisions, demand and profit. Then also say 1</w:t>
       </w:r>
       <w:r>
         <w:rPr>
@@ -1535,7 +1210,6 @@
       </w:r>
     </w:p>
     <w:p>
-      <w:proofErr w:type="spellStart"/>
       <w:r>
         <w:rPr>
           <w:b/>
@@ -1543,25 +1217,8 @@
         </w:rPr>
         <w:t>Leaderboard.tsx</w:t>
       </w:r>
-      <w:proofErr w:type="spellEnd"/>
-      <w:r>
-        <w:t xml:space="preserve"> → </w:t>
-      </w:r>
-      <w:proofErr w:type="spellStart"/>
-      <w:r>
-        <w:t>src</w:t>
-      </w:r>
-      <w:proofErr w:type="spellEnd"/>
-      <w:r>
-        <w:t>\components\</w:t>
-      </w:r>
-      <w:proofErr w:type="spellStart"/>
-      <w:r>
-        <w:t>Leaderboard.tsx</w:t>
-      </w:r>
-      <w:proofErr w:type="spellEnd"/>
-      <w:r>
-        <w:t>:</w:t>
+      <w:r>
+        <w:t xml:space="preserve"> → src\components\Leaderboard.tsx:</w:t>
       </w:r>
     </w:p>
     <w:p>
@@ -1582,15 +1239,7 @@
         <w:t>"1st", "2nd", "3rd", "4th"</w:t>
       </w:r>
       <w:r>
-        <w:t xml:space="preserve"> </w:t>
-      </w:r>
-      <w:proofErr w:type="gramStart"/>
-      <w:r>
-        <w:t>etc. — no</w:t>
-      </w:r>
-      <w:proofErr w:type="gramEnd"/>
-      <w:r>
-        <w:t xml:space="preserve"> emojis</w:t>
+        <w:t xml:space="preserve"> etc. — no emojis</w:t>
       </w:r>
     </w:p>
     <w:p>
@@ -1633,7 +1282,6 @@
       </w:r>
     </w:p>
     <w:p>
-      <w:proofErr w:type="spellStart"/>
       <w:r>
         <w:rPr>
           <w:b/>
@@ -1641,25 +1289,8 @@
         </w:rPr>
         <w:t>index.ts</w:t>
       </w:r>
-      <w:proofErr w:type="spellEnd"/>
-      <w:r>
-        <w:t xml:space="preserve"> → functions\</w:t>
-      </w:r>
-      <w:proofErr w:type="spellStart"/>
-      <w:r>
-        <w:t>src</w:t>
-      </w:r>
-      <w:proofErr w:type="spellEnd"/>
-      <w:r>
-        <w:t>\</w:t>
-      </w:r>
-      <w:proofErr w:type="spellStart"/>
-      <w:r>
-        <w:t>index.ts</w:t>
-      </w:r>
-      <w:proofErr w:type="spellEnd"/>
-      <w:r>
-        <w:t xml:space="preserve"> (backend):</w:t>
+      <w:r>
+        <w:t xml:space="preserve"> → functions\src\index.ts (backend):</w:t>
       </w:r>
     </w:p>
     <w:p>
@@ -1672,7 +1303,6 @@
       <w:r>
         <w:t xml:space="preserve">Leaderboard rows now include </w:t>
       </w:r>
-      <w:proofErr w:type="spellStart"/>
       <w:r>
         <w:rPr>
           <w:b/>
@@ -1680,11 +1310,9 @@
         </w:rPr>
         <w:t>ordersByWeek</w:t>
       </w:r>
-      <w:proofErr w:type="spellEnd"/>
       <w:r>
         <w:t xml:space="preserve"> and </w:t>
       </w:r>
-      <w:proofErr w:type="spellStart"/>
       <w:r>
         <w:rPr>
           <w:b/>
@@ -1692,21 +1320,11 @@
         </w:rPr>
         <w:t>profitsByWeek</w:t>
       </w:r>
-      <w:proofErr w:type="spellEnd"/>
-      <w:r>
-        <w:t xml:space="preserve"> </w:t>
-      </w:r>
-      <w:proofErr w:type="gramStart"/>
-      <w:r>
-        <w:t>arrays</w:t>
-      </w:r>
-      <w:proofErr w:type="gramEnd"/>
-      <w:r>
-        <w:t xml:space="preserve"> so the frontend has per-week data to display</w:t>
-      </w:r>
-    </w:p>
-    <w:p>
-      <w:proofErr w:type="spellStart"/>
+      <w:r>
+        <w:t xml:space="preserve"> arrays so the frontend has per-week data to display</w:t>
+      </w:r>
+    </w:p>
+    <w:p>
       <w:r>
         <w:rPr>
           <w:b/>
@@ -1714,25 +1332,8 @@
         </w:rPr>
         <w:t>types.ts</w:t>
       </w:r>
-      <w:proofErr w:type="spellEnd"/>
-      <w:r>
-        <w:t xml:space="preserve"> → </w:t>
-      </w:r>
-      <w:proofErr w:type="spellStart"/>
-      <w:r>
-        <w:t>src</w:t>
-      </w:r>
-      <w:proofErr w:type="spellEnd"/>
-      <w:r>
-        <w:t>\lib\</w:t>
-      </w:r>
-      <w:proofErr w:type="spellStart"/>
-      <w:r>
-        <w:t>types.ts</w:t>
-      </w:r>
-      <w:proofErr w:type="spellEnd"/>
-      <w:r>
-        <w:t>:</w:t>
+      <w:r>
+        <w:t xml:space="preserve"> → src\lib\types.ts:</w:t>
       </w:r>
     </w:p>
     <w:p>
@@ -1743,31 +1344,7 @@
         </w:numPr>
       </w:pPr>
       <w:r>
-        <w:t xml:space="preserve">Added </w:t>
-      </w:r>
-      <w:proofErr w:type="spellStart"/>
-      <w:r>
-        <w:t>ordersByWeek</w:t>
-      </w:r>
-      <w:proofErr w:type="spellEnd"/>
-      <w:r>
-        <w:t xml:space="preserve">? and </w:t>
-      </w:r>
-      <w:proofErr w:type="spellStart"/>
-      <w:r>
-        <w:t>profitsByWeek</w:t>
-      </w:r>
-      <w:proofErr w:type="spellEnd"/>
-      <w:r>
-        <w:t xml:space="preserve">? to the </w:t>
-      </w:r>
-      <w:proofErr w:type="spellStart"/>
-      <w:r>
-        <w:t>LeaderboardRow</w:t>
-      </w:r>
-      <w:proofErr w:type="spellEnd"/>
-      <w:r>
-        <w:t xml:space="preserve"> type</w:t>
+        <w:t>Added ordersByWeek? and profitsByWeek? to the LeaderboardRow type</w:t>
       </w:r>
     </w:p>
     <w:p/>
@@ -1775,31 +1352,13 @@
       <w:r>
         <w:t xml:space="preserve">Download and replace </w:t>
       </w:r>
-      <w:proofErr w:type="spellStart"/>
       <w:r>
         <w:rPr>
           <w:b/>
           <w:bCs/>
         </w:rPr>
-        <w:t>src</w:t>
-      </w:r>
-      <w:proofErr w:type="spellEnd"/>
-      <w:r>
-        <w:rPr>
-          <w:b/>
-          <w:bCs/>
-        </w:rPr>
-        <w:t>\components\</w:t>
-      </w:r>
-      <w:proofErr w:type="spellStart"/>
-      <w:r>
-        <w:rPr>
-          <w:b/>
-          <w:bCs/>
-        </w:rPr>
-        <w:t>Leaderboard.tsx</w:t>
-      </w:r>
-      <w:proofErr w:type="spellEnd"/>
+        <w:t>src\components\Leaderboard.tsx</w:t>
+      </w:r>
       <w:r>
         <w:t>. This version:</w:t>
       </w:r>
@@ -1822,15 +1381,7 @@
         <w:t>"1st", "2nd", "3rd", "4th"</w:t>
       </w:r>
       <w:r>
-        <w:t xml:space="preserve"> </w:t>
-      </w:r>
-      <w:proofErr w:type="gramStart"/>
-      <w:r>
-        <w:t>etc. —</w:t>
-      </w:r>
-      <w:proofErr w:type="gramEnd"/>
-      <w:r>
-        <w:t xml:space="preserve"> no medal emojis</w:t>
+        <w:t xml:space="preserve"> etc. — no medal emojis</w:t>
       </w:r>
     </w:p>
     <w:p>
@@ -1864,67 +1415,17 @@
     </w:p>
     <w:p>
       <w:r>
-        <w:t xml:space="preserve">Also make sure you </w:t>
-      </w:r>
-      <w:proofErr w:type="gramStart"/>
-      <w:r>
-        <w:t>already</w:t>
-      </w:r>
-      <w:proofErr w:type="gramEnd"/>
-      <w:r>
-        <w:t xml:space="preserve"> replaced </w:t>
-      </w:r>
-      <w:proofErr w:type="spellStart"/>
+        <w:t xml:space="preserve">Also make sure you already replaced </w:t>
+      </w:r>
       <w:r>
         <w:rPr>
           <w:b/>
           <w:bCs/>
         </w:rPr>
-        <w:t>src</w:t>
-      </w:r>
-      <w:proofErr w:type="spellEnd"/>
-      <w:r>
-        <w:rPr>
-          <w:b/>
-          <w:bCs/>
-        </w:rPr>
-        <w:t>\lib\</w:t>
-      </w:r>
-      <w:proofErr w:type="spellStart"/>
-      <w:r>
-        <w:rPr>
-          <w:b/>
-          <w:bCs/>
-        </w:rPr>
-        <w:t>types.ts</w:t>
-      </w:r>
-      <w:proofErr w:type="spellEnd"/>
-      <w:r>
-        <w:t xml:space="preserve"> with the updated version (adds </w:t>
-      </w:r>
-      <w:proofErr w:type="spellStart"/>
-      <w:r>
-        <w:t>ordersByWeek</w:t>
-      </w:r>
-      <w:proofErr w:type="spellEnd"/>
-      <w:r>
-        <w:t xml:space="preserve"> and </w:t>
-      </w:r>
-      <w:proofErr w:type="spellStart"/>
-      <w:r>
-        <w:t>profitsByWeek</w:t>
-      </w:r>
-      <w:proofErr w:type="spellEnd"/>
-      <w:r>
-        <w:t xml:space="preserve"> to </w:t>
-      </w:r>
-      <w:proofErr w:type="spellStart"/>
-      <w:r>
-        <w:t>LeaderboardRow</w:t>
-      </w:r>
-      <w:proofErr w:type="spellEnd"/>
-      <w:r>
-        <w:t>). If not:</w:t>
+        <w:t>src\lib\types.ts</w:t>
+      </w:r>
+      <w:r>
+        <w:t xml:space="preserve"> with the updated version (adds ordersByWeek and profitsByWeek to LeaderboardRow). If not:</w:t>
       </w:r>
     </w:p>
     <w:p>
@@ -1960,27 +1461,9 @@
           <w:numId w:val="11"/>
         </w:numPr>
       </w:pPr>
-      <w:proofErr w:type="spellStart"/>
-      <w:r>
-        <w:t>Leaderboard.tsx</w:t>
-      </w:r>
-      <w:proofErr w:type="spellEnd"/>
-      <w:r>
-        <w:t xml:space="preserve"> → </w:t>
-      </w:r>
-      <w:proofErr w:type="spellStart"/>
-      <w:r>
-        <w:t>src</w:t>
-      </w:r>
-      <w:proofErr w:type="spellEnd"/>
-      <w:r>
-        <w:t>\components\</w:t>
-      </w:r>
-      <w:proofErr w:type="spellStart"/>
-      <w:r>
-        <w:t>Leaderboard.tsx</w:t>
-      </w:r>
-      <w:proofErr w:type="spellEnd"/>
+      <w:r>
+        <w:t>Leaderboard.tsx → src\components\Leaderboard.tsx</w:t>
+      </w:r>
     </w:p>
     <w:p>
       <w:pPr>
@@ -1989,27 +1472,9 @@
           <w:numId w:val="11"/>
         </w:numPr>
       </w:pPr>
-      <w:proofErr w:type="spellStart"/>
-      <w:r>
-        <w:t>types.ts</w:t>
-      </w:r>
-      <w:proofErr w:type="spellEnd"/>
-      <w:r>
-        <w:t xml:space="preserve"> → </w:t>
-      </w:r>
-      <w:proofErr w:type="spellStart"/>
-      <w:r>
-        <w:t>src</w:t>
-      </w:r>
-      <w:proofErr w:type="spellEnd"/>
-      <w:r>
-        <w:t>\lib\</w:t>
-      </w:r>
-      <w:proofErr w:type="spellStart"/>
-      <w:r>
-        <w:t>types.ts</w:t>
-      </w:r>
-      <w:proofErr w:type="spellEnd"/>
+      <w:r>
+        <w:t>types.ts → src\lib\types.ts</w:t>
+      </w:r>
     </w:p>
     <w:p/>
     <w:p>
@@ -2162,22 +1627,22 @@
           <w:b/>
           <w:bCs/>
         </w:rPr>
-        <w:t xml:space="preserve">"Finish </w:t>
-      </w:r>
-      <w:proofErr w:type="gramStart"/>
+        <w:t>"Finish week"</w:t>
+      </w:r>
+      <w:r>
+        <w:t xml:space="preserve"> — Forces the current week to end, even if not all players have submitted. Useful in class when someone is slow or absent. It auto-submits a default order for anyone who hasn't decided yet.</w:t>
+      </w:r>
+    </w:p>
+    <w:p>
       <w:r>
         <w:rPr>
           <w:b/>
           <w:bCs/>
         </w:rPr>
-        <w:t>week"</w:t>
-      </w:r>
-      <w:r>
-        <w:t xml:space="preserve"> —</w:t>
-      </w:r>
-      <w:proofErr w:type="gramEnd"/>
-      <w:r>
-        <w:t xml:space="preserve"> Forces the current week to end, even if not all players have submitted. Useful in class when someone is slow or absent. It auto-submits a default order for anyone who hasn't decided yet.</w:t>
+        <w:t>"End session early"</w:t>
+      </w:r>
+      <w:r>
+        <w:t xml:space="preserve"> — Stops the entire game before all weeks are played. Useful when you're running out of class time.</w:t>
       </w:r>
     </w:p>
     <w:p>
@@ -2186,189 +1651,87 @@
           <w:b/>
           <w:bCs/>
         </w:rPr>
-        <w:t xml:space="preserve">"End session </w:t>
-      </w:r>
-      <w:proofErr w:type="gramStart"/>
+        <w:t>"Show leaderboard to players"</w:t>
+      </w:r>
+      <w:r>
+        <w:t xml:space="preserve"> — When checked, players can see the live rankings. You might want to hide it early and reveal it at the end for dramatic effect.</w:t>
+      </w:r>
+    </w:p>
+    <w:p>
       <w:r>
         <w:rPr>
           <w:b/>
           <w:bCs/>
         </w:rPr>
-        <w:t>early"</w:t>
-      </w:r>
-      <w:r>
-        <w:t xml:space="preserve"> —</w:t>
-      </w:r>
-      <w:proofErr w:type="gramEnd"/>
-      <w:r>
-        <w:t xml:space="preserve"> Stops the entire game before all weeks are played. Useful when you're running out of class time.</w:t>
-      </w:r>
-    </w:p>
-    <w:p>
+        <w:t>Optimal Q*: 67</w:t>
+      </w:r>
+      <w:r>
+        <w:t xml:space="preserve"> — The theoretically optimal order (only visible to the host, not players). </w:t>
+      </w:r>
       <w:r>
         <w:rPr>
           <w:b/>
           <w:bCs/>
         </w:rPr>
-        <w:t xml:space="preserve">"Show leaderboard to </w:t>
-      </w:r>
-      <w:proofErr w:type="gramStart"/>
+        <w:t>Best in-game Q: 70</w:t>
+      </w:r>
+      <w:r>
+        <w:t xml:space="preserve"> — The order quantity that would have actually maximized profit on the specific demand draws in this session.</w:t>
+      </w:r>
+    </w:p>
+    <w:p>
+      <w:r>
+        <w:t>As for simplifying — I wouldn't remove any of these. They're all useful for classroom management. The "Finish week" and "End session early" buttons are essential when you have 50+ students and need to keep things moving. The blog post specifically mentions how important it is for instructors to have this flexibility.</w:t>
+      </w:r>
+    </w:p>
+    <w:p>
+      <w:r>
+        <w:t xml:space="preserve">What you </w:t>
+      </w:r>
+      <w:r>
+        <w:rPr>
+          <w:i/>
+          <w:iCs/>
+        </w:rPr>
+        <w:t>could</w:t>
+      </w:r>
+      <w:r>
+        <w:t xml:space="preserve"> simplify is the display — for example, hiding "Optimal Q*" and "Best in-game Q" behind a toggle so the host screen looks cleaner during the game and you only reveal them during the debrief.</w:t>
+      </w:r>
+    </w:p>
+    <w:p/>
+    <w:p>
+      <w:r>
+        <w:t xml:space="preserve">ISSUE: </w:t>
+      </w:r>
+      <w:r>
+        <w:t>Week should have 7 days not 5. Also, show little vertical lines on the x-axis for each day of the Week 1, Week 2 etc. Further, show the past data in dashed line and make the vertical dashed line more distinct to show past data and new data. Also, title on the y-axis of bottom plot should be "Realized Demand"</w:t>
+      </w:r>
+    </w:p>
+    <w:p/>
+    <w:p>
+      <w:r>
+        <w:lastRenderedPageBreak/>
+        <w:t xml:space="preserve">NOTE: </w:t>
+      </w:r>
+      <w:r>
+        <w:t>the game is designed around 5-day weeks (Mon–Fri), and the Cloud Functions generate demand data in multiples of 5. Changing to 7 days would break the backend logic (session creation, demand generation, profit calculation all use weeks * 5).</w:t>
+      </w:r>
+    </w:p>
+    <w:p/>
+    <w:p>
+      <w:r>
+        <w:t xml:space="preserve">Download and replace </w:t>
+      </w:r>
       <w:r>
         <w:rPr>
           <w:b/>
           <w:bCs/>
         </w:rPr>
-        <w:t>players"</w:t>
-      </w:r>
-      <w:r>
-        <w:t xml:space="preserve"> —</w:t>
-      </w:r>
-      <w:proofErr w:type="gramEnd"/>
-      <w:r>
-        <w:t xml:space="preserve"> When checked, players can see the live rankings. You might want to hide it early and reveal it at the end for dramatic effect.</w:t>
-      </w:r>
-    </w:p>
-    <w:p>
-      <w:r>
-        <w:rPr>
-          <w:b/>
-          <w:bCs/>
-        </w:rPr>
-        <w:t>Optimal Q*: 67</w:t>
-      </w:r>
-      <w:r>
-        <w:t xml:space="preserve"> — The theoretically optimal order (only visible to the host, not players). </w:t>
-      </w:r>
-      <w:r>
-        <w:rPr>
-          <w:b/>
-          <w:bCs/>
-        </w:rPr>
-        <w:t>Best in-game Q: 70</w:t>
-      </w:r>
-      <w:r>
-        <w:t xml:space="preserve"> — The order quantity that would have </w:t>
-      </w:r>
-      <w:proofErr w:type="gramStart"/>
-      <w:r>
-        <w:t>actually maximized</w:t>
-      </w:r>
-      <w:proofErr w:type="gramEnd"/>
-      <w:r>
-        <w:t xml:space="preserve"> profit on the specific demand draws in this session.</w:t>
-      </w:r>
-    </w:p>
-    <w:p>
-      <w:r>
-        <w:t xml:space="preserve">As for </w:t>
-      </w:r>
-      <w:proofErr w:type="gramStart"/>
-      <w:r>
-        <w:t>simplifying —</w:t>
-      </w:r>
-      <w:proofErr w:type="gramEnd"/>
-      <w:r>
-        <w:t xml:space="preserve"> I wouldn't remove any of these. They're all useful for classroom management. The "Finish week" and "End session early" buttons are essential when you have 50+ students and need to keep things moving. The blog post specifically mentions how important it is for instructors to have this flexibility.</w:t>
-      </w:r>
-    </w:p>
-    <w:p>
-      <w:r>
-        <w:t xml:space="preserve">What you </w:t>
-      </w:r>
-      <w:r>
-        <w:rPr>
-          <w:i/>
-          <w:iCs/>
-        </w:rPr>
-        <w:t>could</w:t>
-      </w:r>
-      <w:r>
-        <w:t xml:space="preserve"> simplify is the display — for example, hiding "Optimal Q*" and "Best in-game Q" behind a toggle so the host screen looks cleaner during the </w:t>
-      </w:r>
-      <w:proofErr w:type="gramStart"/>
-      <w:r>
-        <w:t>game</w:t>
-      </w:r>
-      <w:proofErr w:type="gramEnd"/>
-      <w:r>
-        <w:t xml:space="preserve"> and you only reveal them during the debrief.</w:t>
-      </w:r>
-    </w:p>
-    <w:p/>
-    <w:p>
-      <w:r>
-        <w:t xml:space="preserve">ISSUE: </w:t>
-      </w:r>
-      <w:r>
-        <w:t xml:space="preserve">Week should have 7 days not 5. Also, show little vertical lines on the x-axis for each day of </w:t>
-      </w:r>
-      <w:proofErr w:type="gramStart"/>
-      <w:r>
-        <w:t>the Week</w:t>
-      </w:r>
-      <w:proofErr w:type="gramEnd"/>
-      <w:r>
-        <w:t xml:space="preserve"> 1, Week 2 etc. Further, show the past data in dashed line and make the vertical dashed line more distinct to show past data and new data. Also, title on the y-axis of bottom plot should be "Realized Demand"</w:t>
-      </w:r>
-    </w:p>
-    <w:p/>
-    <w:p>
-      <w:r>
-        <w:lastRenderedPageBreak/>
-        <w:t xml:space="preserve">NOTE: </w:t>
-      </w:r>
-      <w:r>
-        <w:t xml:space="preserve">the game is designed around 5-day weeks (Mon–Fri), and the Cloud Functions generate demand data in multiples of 5. Changing to 7 days would break the backend logic (session creation, demand generation, profit calculation all </w:t>
-      </w:r>
-      <w:proofErr w:type="gramStart"/>
-      <w:r>
-        <w:t>use</w:t>
-      </w:r>
-      <w:proofErr w:type="gramEnd"/>
-      <w:r>
-        <w:t xml:space="preserve"> weeks * 5).</w:t>
-      </w:r>
-    </w:p>
-    <w:p/>
-    <w:p>
-      <w:r>
-        <w:t xml:space="preserve">Download and replace </w:t>
-      </w:r>
-      <w:proofErr w:type="spellStart"/>
-      <w:r>
-        <w:rPr>
-          <w:b/>
-          <w:bCs/>
-        </w:rPr>
-        <w:t>src</w:t>
-      </w:r>
-      <w:proofErr w:type="spellEnd"/>
-      <w:r>
-        <w:rPr>
-          <w:b/>
-          <w:bCs/>
-        </w:rPr>
-        <w:t>\components\</w:t>
-      </w:r>
-      <w:proofErr w:type="spellStart"/>
-      <w:r>
-        <w:rPr>
-          <w:b/>
-          <w:bCs/>
-        </w:rPr>
-        <w:t>TrainingChart.tsx</w:t>
-      </w:r>
-      <w:proofErr w:type="spellEnd"/>
-      <w:r>
-        <w:t xml:space="preserve">. The </w:t>
-      </w:r>
-      <w:proofErr w:type="spellStart"/>
-      <w:r>
-        <w:t>PlayerGame.tsx</w:t>
-      </w:r>
-      <w:proofErr w:type="spellEnd"/>
-      <w:r>
-        <w:t xml:space="preserve"> from before is still correct — no changes needed there.</w:t>
+        <w:t>src\components\TrainingChart.tsx</w:t>
+      </w:r>
+      <w:r>
+        <w:t>. The PlayerGame.tsx from before is still correct — no changes needed there.</w:t>
       </w:r>
     </w:p>
     <w:p>
@@ -2429,15 +1792,7 @@
         <w:t>stronger</w:t>
       </w:r>
       <w:r>
-        <w:t xml:space="preserve"> — thicker (#888, </w:t>
-      </w:r>
-      <w:proofErr w:type="spellStart"/>
-      <w:r>
-        <w:t>strokeWidth</w:t>
-      </w:r>
-      <w:proofErr w:type="spellEnd"/>
-      <w:r>
-        <w:t xml:space="preserve"> 1.5, "6 3" dash pattern) so it clearly separates the two phases</w:t>
+        <w:t xml:space="preserve"> — thicker (#888, strokeWidth 1.5, "6 3" dash pattern) so it clearly separates the two phases</w:t>
       </w:r>
     </w:p>
     <w:p>
@@ -2620,21 +1975,8 @@
         <w:t>: D</w:t>
       </w:r>
       <w:r>
-        <w:t xml:space="preserve">ownload and replace </w:t>
-      </w:r>
-      <w:proofErr w:type="spellStart"/>
-      <w:r>
-        <w:t>src</w:t>
-      </w:r>
-      <w:proofErr w:type="spellEnd"/>
-      <w:r>
-        <w:t>\components\</w:t>
-      </w:r>
-      <w:proofErr w:type="spellStart"/>
-      <w:r>
-        <w:t>RevealTheatre.tsx</w:t>
-      </w:r>
-      <w:proofErr w:type="spellEnd"/>
+        <w:t>ownload and replace src\components\RevealTheatre.tsx</w:t>
+      </w:r>
     </w:p>
     <w:p/>
     <w:p/>
@@ -2649,6 +1991,9 @@
     </w:p>
     <w:p>
       <w:r>
+        <w:rPr>
+          <w:noProof/>
+        </w:rPr>
         <w:drawing>
           <wp:inline distT="0" distB="0" distL="0" distR="0" wp14:anchorId="5871A787" wp14:editId="1B34D2D7">
             <wp:extent cx="3854648" cy="1644735"/>
@@ -2721,28 +2066,7 @@
         <w:t>Input UX</w:t>
       </w:r>
       <w:r>
-        <w:t xml:space="preserve"> — can't clear the field to type a new value because </w:t>
-      </w:r>
-      <w:proofErr w:type="gramStart"/>
-      <w:r>
-        <w:t>Number(</w:t>
-      </w:r>
-      <w:proofErr w:type="gramEnd"/>
-      <w:r>
-        <w:t xml:space="preserve">"") gives 0 and </w:t>
-      </w:r>
-      <w:proofErr w:type="spellStart"/>
-      <w:proofErr w:type="gramStart"/>
-      <w:r>
-        <w:t>Math.max</w:t>
-      </w:r>
-      <w:proofErr w:type="spellEnd"/>
-      <w:r>
-        <w:t>(</w:t>
-      </w:r>
-      <w:proofErr w:type="gramEnd"/>
-      <w:r>
-        <w:t>1, 0) snaps it to 1</w:t>
+        <w:t xml:space="preserve"> — can't clear the field to type a new value because Number("") gives 0 and Math.max(1, 0) snaps it to 1</w:t>
       </w:r>
     </w:p>
     <w:p/>
@@ -5160,6 +4484,7 @@
   <w:style w:type="character" w:default="1" w:styleId="DefaultParagraphFont">
     <w:name w:val="Default Paragraph Font"/>
     <w:uiPriority w:val="1"/>
+    <w:semiHidden/>
     <w:unhideWhenUsed/>
   </w:style>
   <w:style w:type="table" w:default="1" w:styleId="TableNormal">

</xml_diff>